<commit_message>
Volume 1, Chapter 6: cpp-httplib 0.59.0 (security fixes), real-world tool names
</commit_message>
<xml_diff>
--- a/Volume 1/Chapter 06 - RESTful APIs/SPA_Vol1_Ch6_Lesson6_0_API_Setup.docx
+++ b/Volume 1/Chapter 06 - RESTful APIs/SPA_Vol1_Ch6_Lesson6_0_API_Setup.docx
@@ -274,7 +274,7 @@
         <w:keepNext/>
       </w:pPr>
       <w:r>
-        <w:t>C++         cpp-httplib 0.58.0 + OpenSSL   cpp-httplib 0.58.0 + OpenSSL</w:t>
+        <w:t>C++         cpp-httplib 0.59.0 + OpenSSL   cpp-httplib 0.59.0 + OpenSSL</w:t>
       </w:r>
     </w:p>
     <w:p>
@@ -1774,7 +1774,7 @@
         <w:keepNext/>
       </w:pPr>
       <w:r>
-        <w:t>Back in PowerShell, in the lesson-6.0 folder. npm installs undici and the TypeScript compiler from package.json. curl.exe downloads cpp-httplib's one header from its 0.58.0 release; remember, -fsSL fails on an error page, stays quiet except for errors, and follows redirects, and -o names the file to save (Lesson 2.17).</w:t>
+        <w:t>Back in PowerShell, in the lesson-6.0 folder. npm installs undici and the TypeScript compiler from package.json. curl.exe downloads cpp-httplib's one header from its 0.59.0 release, which the course moved to for its security fixes; remember, -fsSL fails on an error page, stays quiet except for errors, and follows redirects, and -o names the file to save (Lesson 2.17).</w:t>
       </w:r>
     </w:p>
     <w:p>
@@ -1805,7 +1805,7 @@
         <w:pStyle w:val="CommandBlock"/>
       </w:pPr>
       <w:r>
-        <w:t xml:space="preserve">    https://raw.githubusercontent.com/yhirose/cpp-httplib/v0.58.0/httplib.h</w:t>
+        <w:t xml:space="preserve">    https://raw.githubusercontent.com/yhirose/cpp-httplib/v0.59.0/httplib.h</w:t>
       </w:r>
     </w:p>
     <w:p>
@@ -1829,7 +1829,7 @@
         <w:t xml:space="preserve">The C++ programs need OpenSSL built with Visual C++. vcpkg, Microsoft's C and C++ package manager, comes with the Build Tools and is on PATH in the Developer PowerShell that Launch-VsDevShell starts. .\cpp\vcpkg.json names the one package the project needs, openssl, and pins it with an override to version 3.5.4, and .\cpp\vcpkg-configuration.json pins the exact version of vcpkg's package list, so every learner builds the same OpenSSL. 3.5 is OpenSSL's long-term support (LTS) line, which gets security fixes </w:t>
       </w:r>
       <w:r>
-        <w:t>until 2030, while a non-LTS line such as 3.6 loses support within about a year; a library that every later lesson copies should stay supported. vcpkg install reads both, downloads OpenSSL's source, and builds it into .\cpp\vcpkg_installed; it takes a few minutes the first time.</w:t>
+        <w:t>until 2030, while a non-LTS line such as 3.6 loses support within about a year; a library that every later lesson copies should stay supported. vcpkg's 3.5 line stops at 3.5.4. OpenSSL's later 3.5 releases fix parts these servers do not use (CMS, PKCS7, PKCS12, QUIC and DTLS), so the course stays on vcpkg's 3.5.4 build until vcpkg ships a newer 3.5 release. vcpkg install reads both, downloads OpenSSL's source, and builds it into .\cpp\vcpkg_installed; it takes a few minutes the first time.</w:t>
       </w:r>
     </w:p>
     <w:p>
@@ -2080,7 +2080,7 @@
         <w:keepNext/>
       </w:pPr>
       <w:r>
-        <w:t>AA14E7E7BD2703694E0A6B6855AF3B8C406102AB1FC56AC905FE33619B31FAA5</w:t>
+        <w:t>DC1E4DE3E0EF3A18F3A5818FAB563EB3FA45D5D3BB1DB527A8D389077ED5EE6C</w:t>
       </w:r>
     </w:p>
     <w:p>
@@ -2141,7 +2141,7 @@
         <w:keepNext/>
       </w:pPr>
       <w:r>
-        <w:t xml:space="preserve">    https://raw.githubusercontent.com/yhirose/cpp-httplib/v0.58.0/httplib.h</w:t>
+        <w:t xml:space="preserve">    https://raw.githubusercontent.com/yhirose/cpp-httplib/v0.59.0/httplib.h</w:t>
       </w:r>
     </w:p>
     <w:p>
@@ -19042,7 +19042,10 @@
     </w:p>
     <w:p>
       <w:r>
-        <w:t>TypeScript uses node:https, Node's built-in HTTPS server, for the server, and fetch for the client. Node's own fetch is built on a library named undici, and undici's Agent is what accepts a certificate authority, so step 4's npm install added undici 8.11.2, and the client imports both fetch and Agent from it. Remember, npm --prefix .\typescript run build compiles every file in .\typescript\src into .\typescript\dist (Lesson 2.17); the server's build block builds the clients too.</w:t>
+        <w:t>TypeScript uses node:https, Node's built-in HTTPS server, for the server, and fetch for the client. Real Node web apps use a framework such as Express or Fastify on top of node:https, and Chapter 8 moves to Express; this chapter uses node:https itself so every line of the server stays visible. Node's own fetch is built on a library named undici, and undici's Agent is what accepts a certificate authority, so step 4's npm install added undici 8.11.2, and the client imports both fetch and Agent from it. Rememb</w:t>
+      </w:r>
+      <w:r>
+        <w:t>er, npm --prefix .\typescript run build compiles every file in .\typescript\src into .\typescript\dist (Lesson 2.17); the server's build block builds the clients too.</w:t>
       </w:r>
     </w:p>
     <w:p>
@@ -23439,31 +23442,31 @@
       </w:rPr>
     </w:lvl>
   </w:abstractNum>
-  <w:num w:numId="1" w16cid:durableId="1288076088">
+  <w:num w:numId="1" w16cid:durableId="1021199977">
     <w:abstractNumId w:val="8"/>
   </w:num>
-  <w:num w:numId="2" w16cid:durableId="381908576">
+  <w:num w:numId="2" w16cid:durableId="1147015183">
     <w:abstractNumId w:val="6"/>
   </w:num>
-  <w:num w:numId="3" w16cid:durableId="746877295">
+  <w:num w:numId="3" w16cid:durableId="247233195">
     <w:abstractNumId w:val="5"/>
   </w:num>
-  <w:num w:numId="4" w16cid:durableId="345790196">
+  <w:num w:numId="4" w16cid:durableId="331181039">
     <w:abstractNumId w:val="4"/>
   </w:num>
-  <w:num w:numId="5" w16cid:durableId="1787775197">
+  <w:num w:numId="5" w16cid:durableId="786238219">
     <w:abstractNumId w:val="7"/>
   </w:num>
-  <w:num w:numId="6" w16cid:durableId="1397582318">
+  <w:num w:numId="6" w16cid:durableId="1797794104">
     <w:abstractNumId w:val="3"/>
   </w:num>
-  <w:num w:numId="7" w16cid:durableId="1832939626">
+  <w:num w:numId="7" w16cid:durableId="899250850">
     <w:abstractNumId w:val="2"/>
   </w:num>
-  <w:num w:numId="8" w16cid:durableId="1099182609">
+  <w:num w:numId="8" w16cid:durableId="281807565">
     <w:abstractNumId w:val="1"/>
   </w:num>
-  <w:num w:numId="9" w16cid:durableId="1030952732">
+  <w:num w:numId="9" w16cid:durableId="18548141">
     <w:abstractNumId w:val="0"/>
   </w:num>
 </w:numbering>

</xml_diff>

<commit_message>
Volume 1, Chapter 6: each language uses its own tables and folders; every setup step tested
</commit_message>
<xml_diff>
--- a/Volume 1/Chapter 06 - RESTful APIs/SPA_Vol1_Ch6_Lesson6_0_API_Setup.docx
+++ b/Volume 1/Chapter 06 - RESTful APIs/SPA_Vol1_Ch6_Lesson6_0_API_Setup.docx
@@ -856,7 +856,7 @@
     </w:p>
     <w:p>
       <w:r>
-        <w:t>Setup has four steps: the lesson folder, the course CA and the server certificate, the .gitignore file, and the libraries. Every later Chapter 6 lesson copies this lesson's certs folder, .\cpp\vcpkg_installed, and .\cpp\httplib.h into its own folder, so OpenSSL is built once, and repeats only step 4's npm install.</w:t>
+        <w:t>Setup has four steps: the lesson folder, the course CA and the server certificate, the .gitignore file, and the libraries. Every later Chapter 6 lesson copies this lesson's certs folder, .\cpp\vcpkg_installed, and .\cpp\httplib.h into its own folder, so OpenSSL is built once; each lesson still makes its own C#, Go, and TypeScript projects with the tools, as this one does.</w:t>
       </w:r>
     </w:p>
     <w:p>
@@ -1104,9 +1104,270 @@
     </w:p>
     <w:p>
       <w:pPr>
+        <w:keepNext/>
+      </w:pPr>
+      <w:r>
+        <w:t xml:space="preserve">Next, let the tools create each project's settings file, as in Chapter 1. Remember, dotnet new console -o makes a C# project in the folder -o names, with a .csproj file and a Program.cs; the clients are console projects. The servers use dotnet new web, Microsoft's template for an empty ASP.NET Core web app: its .csproj names Microsoft.NET.Sdk.Web, the web SDK that brings Kestrel, the web server, and it also writes appsettings.json and appsettings.Development.json, settings files that these servers leave at </w:t>
+      </w:r>
+      <w:r>
+        <w:t>their defaults. --exclude-launch-settings leaves out Properties\launchSettings.json, a file that would change how dotnet run starts the server. Each starter Program.cs is replaced with this lesson's code in the C# section. Remember, go mod init makes the .\go folder a module by writing .\go\go.mod. Its go line shows the Go version you have installed.</w:t>
+      </w:r>
+    </w:p>
+    <w:p>
+      <w:pPr>
+        <w:keepNext/>
+      </w:pPr>
+    </w:p>
+    <w:p>
+      <w:pPr>
+        <w:pStyle w:val="CommandBlock"/>
+        <w:keepNext/>
+      </w:pPr>
+      <w:r>
+        <w:t>dotnet new web -o .\csharp\BasicServer --exclude-launch-settings</w:t>
+      </w:r>
+    </w:p>
+    <w:p>
+      <w:pPr>
+        <w:pStyle w:val="CommandBlock"/>
+        <w:keepNext/>
+      </w:pPr>
+      <w:r>
+        <w:t>dotnet new console -o .\csharp\BasicClient</w:t>
+      </w:r>
+    </w:p>
+    <w:p>
+      <w:pPr>
+        <w:pStyle w:val="CommandBlock"/>
+        <w:keepNext/>
+      </w:pPr>
+      <w:r>
+        <w:t>dotnet new web -o .\csharp\Server --exclude-launch-settings</w:t>
+      </w:r>
+    </w:p>
+    <w:p>
+      <w:pPr>
+        <w:pStyle w:val="CommandBlock"/>
+        <w:keepNext/>
+      </w:pPr>
+      <w:r>
+        <w:t>dotnet new console -o .\csharp\Client</w:t>
+      </w:r>
+    </w:p>
+    <w:p>
+      <w:pPr>
+        <w:pStyle w:val="CommandBlock"/>
+      </w:pPr>
+      <w:r>
+        <w:t>go -C .\go mod init example.com/apisetup</w:t>
+      </w:r>
+    </w:p>
+    <w:p>
+      <w:pPr>
+        <w:keepNext/>
+      </w:pPr>
+    </w:p>
+    <w:p>
+      <w:r>
+        <w:t>The web template's .csproj lacks two settings these servers use: OutputType Exe, and RunWorkingDirectory, which makes dotnet run start the server in the folder you run it from, lesson-6.0, where certs is (the C# What to Notice explains it). So type each server's .csproj over the one dotnet new made. notepad .\csharp\BasicServer\BasicServer.csproj opens the file: press Ctrl+A, type the file below in place of its lines, save it with Ctrl+S, and close Notepad. Do the same for .\csharp\Server\Server.csproj.</w:t>
+      </w:r>
+    </w:p>
+    <w:p>
+      <w:pPr>
+        <w:keepNext/>
+      </w:pPr>
+    </w:p>
+    <w:p>
+      <w:pPr>
         <w:pStyle w:val="Heading3"/>
       </w:pPr>
       <w:r>
+        <w:t>csharp/BasicServer/BasicServer.csproj</w:t>
+      </w:r>
+    </w:p>
+    <w:p>
+      <w:pPr>
+        <w:pStyle w:val="SourceCode"/>
+        <w:keepNext/>
+      </w:pPr>
+      <w:r>
+        <w:t>&lt;Project Sdk="Microsoft.NET.Sdk.Web"&gt;</w:t>
+      </w:r>
+    </w:p>
+    <w:p>
+      <w:pPr>
+        <w:pStyle w:val="SourceCode"/>
+        <w:keepNext/>
+      </w:pPr>
+      <w:r>
+        <w:t xml:space="preserve">  &lt;PropertyGroup&gt;</w:t>
+      </w:r>
+    </w:p>
+    <w:p>
+      <w:pPr>
+        <w:pStyle w:val="SourceCode"/>
+        <w:keepNext/>
+      </w:pPr>
+      <w:r>
+        <w:t xml:space="preserve">    &lt;OutputType&gt;Exe&lt;/OutputType&gt;</w:t>
+      </w:r>
+    </w:p>
+    <w:p>
+      <w:pPr>
+        <w:pStyle w:val="SourceCode"/>
+        <w:keepNext/>
+      </w:pPr>
+      <w:r>
+        <w:t xml:space="preserve">    &lt;TargetFramework&gt;net10.0&lt;/TargetFramework&gt;</w:t>
+      </w:r>
+    </w:p>
+    <w:p>
+      <w:pPr>
+        <w:pStyle w:val="SourceCode"/>
+        <w:keepNext/>
+      </w:pPr>
+      <w:r>
+        <w:t xml:space="preserve">    &lt;ImplicitUsings&gt;enable&lt;/ImplicitUsings&gt;</w:t>
+      </w:r>
+    </w:p>
+    <w:p>
+      <w:pPr>
+        <w:pStyle w:val="SourceCode"/>
+        <w:keepNext/>
+      </w:pPr>
+      <w:r>
+        <w:t xml:space="preserve">    &lt;Nullable&gt;enable&lt;/Nullable&gt;</w:t>
+      </w:r>
+    </w:p>
+    <w:p>
+      <w:pPr>
+        <w:pStyle w:val="SourceCode"/>
+        <w:keepNext/>
+      </w:pPr>
+      <w:r>
+        <w:t xml:space="preserve">    &lt;RunWorkingDirectory&gt;$(MSBuildStartupDirectory)&lt;/RunWorkingDirectory&gt;</w:t>
+      </w:r>
+    </w:p>
+    <w:p>
+      <w:pPr>
+        <w:pStyle w:val="SourceCode"/>
+        <w:keepNext/>
+      </w:pPr>
+      <w:r>
+        <w:t xml:space="preserve">  &lt;/PropertyGroup&gt;</w:t>
+      </w:r>
+    </w:p>
+    <w:p>
+      <w:pPr>
+        <w:pStyle w:val="SourceCode"/>
+      </w:pPr>
+      <w:r>
+        <w:t>&lt;/Project&gt;</w:t>
+      </w:r>
+    </w:p>
+    <w:p>
+      <w:pPr>
+        <w:keepNext/>
+      </w:pPr>
+    </w:p>
+    <w:p>
+      <w:pPr>
+        <w:pStyle w:val="Heading3"/>
+      </w:pPr>
+      <w:r>
+        <w:t>csharp/Server/Server.csproj</w:t>
+      </w:r>
+    </w:p>
+    <w:p>
+      <w:pPr>
+        <w:pStyle w:val="SourceCode"/>
+        <w:keepNext/>
+      </w:pPr>
+      <w:r>
+        <w:t>&lt;Project Sdk="Microsoft.NET.Sdk.Web"&gt;</w:t>
+      </w:r>
+    </w:p>
+    <w:p>
+      <w:pPr>
+        <w:pStyle w:val="SourceCode"/>
+        <w:keepNext/>
+      </w:pPr>
+      <w:r>
+        <w:t xml:space="preserve">  &lt;PropertyGroup&gt;</w:t>
+      </w:r>
+    </w:p>
+    <w:p>
+      <w:pPr>
+        <w:pStyle w:val="SourceCode"/>
+        <w:keepNext/>
+      </w:pPr>
+      <w:r>
+        <w:t xml:space="preserve">    &lt;OutputType&gt;Exe&lt;/OutputType&gt;</w:t>
+      </w:r>
+    </w:p>
+    <w:p>
+      <w:pPr>
+        <w:pStyle w:val="SourceCode"/>
+        <w:keepNext/>
+      </w:pPr>
+      <w:r>
+        <w:t xml:space="preserve">    &lt;TargetFramework&gt;net10.0&lt;/TargetFramework&gt;</w:t>
+      </w:r>
+    </w:p>
+    <w:p>
+      <w:pPr>
+        <w:pStyle w:val="SourceCode"/>
+        <w:keepNext/>
+      </w:pPr>
+      <w:r>
+        <w:t xml:space="preserve">    &lt;ImplicitUsings&gt;enable&lt;/ImplicitUsings&gt;</w:t>
+      </w:r>
+    </w:p>
+    <w:p>
+      <w:pPr>
+        <w:pStyle w:val="SourceCode"/>
+        <w:keepNext/>
+      </w:pPr>
+      <w:r>
+        <w:t xml:space="preserve">    &lt;Nullable&gt;enable&lt;/Nullable&gt;</w:t>
+      </w:r>
+    </w:p>
+    <w:p>
+      <w:pPr>
+        <w:pStyle w:val="SourceCode"/>
+        <w:keepNext/>
+      </w:pPr>
+      <w:r>
+        <w:t xml:space="preserve">    &lt;RunWorkingDirectory&gt;$(MSBuildStartupDirectory)&lt;/RunWorkingDirectory&gt;</w:t>
+      </w:r>
+    </w:p>
+    <w:p>
+      <w:pPr>
+        <w:pStyle w:val="SourceCode"/>
+        <w:keepNext/>
+      </w:pPr>
+      <w:r>
+        <w:t xml:space="preserve">  &lt;/PropertyGroup&gt;</w:t>
+      </w:r>
+    </w:p>
+    <w:p>
+      <w:pPr>
+        <w:pStyle w:val="SourceCode"/>
+      </w:pPr>
+      <w:r>
+        <w:t>&lt;/Project&gt;</w:t>
+      </w:r>
+    </w:p>
+    <w:p>
+      <w:pPr>
+        <w:keepNext/>
+      </w:pPr>
+    </w:p>
+    <w:p>
+      <w:pPr>
+        <w:pStyle w:val="Heading3"/>
+      </w:pPr>
+      <w:r>
         <w:t>Linux or macOS Project Setup</w:t>
       </w:r>
     </w:p>
@@ -1164,8 +1425,70 @@
       </w:pPr>
     </w:p>
     <w:p>
-      <w:r>
-        <w:t>Save each source and supporting file from this lesson into the matching path in the project layout. As in Chapter 1, notepad .\c\basic_server.c creates and opens one: choose Yes, type the file, save it with Ctrl+S, and close Notepad. On Linux, nano ./c/basic_server.c does the same: type the file, then save and close it with Ctrl+O, Enter, then Ctrl+X.</w:t>
+      <w:pPr>
+        <w:keepNext/>
+      </w:pPr>
+      <w:r>
+        <w:t>Then create the C# and Go projects with the same commands as on Windows, and type each server's .csproj exactly as shown in the Windows setup.</w:t>
+      </w:r>
+    </w:p>
+    <w:p>
+      <w:pPr>
+        <w:keepNext/>
+      </w:pPr>
+    </w:p>
+    <w:p>
+      <w:pPr>
+        <w:pStyle w:val="CommandBlock"/>
+        <w:keepNext/>
+      </w:pPr>
+      <w:r>
+        <w:t>dotnet new web -o ./csharp/BasicServer --exclude-launch-settings</w:t>
+      </w:r>
+    </w:p>
+    <w:p>
+      <w:pPr>
+        <w:pStyle w:val="CommandBlock"/>
+        <w:keepNext/>
+      </w:pPr>
+      <w:r>
+        <w:t>dotnet new console -o ./csharp/BasicClient</w:t>
+      </w:r>
+    </w:p>
+    <w:p>
+      <w:pPr>
+        <w:pStyle w:val="CommandBlock"/>
+        <w:keepNext/>
+      </w:pPr>
+      <w:r>
+        <w:t>dotnet new web -o ./csharp/Server --exclude-launch-settings</w:t>
+      </w:r>
+    </w:p>
+    <w:p>
+      <w:pPr>
+        <w:pStyle w:val="CommandBlock"/>
+        <w:keepNext/>
+      </w:pPr>
+      <w:r>
+        <w:t>dotnet new console -o ./csharp/Client</w:t>
+      </w:r>
+    </w:p>
+    <w:p>
+      <w:pPr>
+        <w:pStyle w:val="CommandBlock"/>
+      </w:pPr>
+      <w:r>
+        <w:t>go -C ./go mod init example.com/apisetup</w:t>
+      </w:r>
+    </w:p>
+    <w:p>
+      <w:pPr>
+        <w:keepNext/>
+      </w:pPr>
+    </w:p>
+    <w:p>
+      <w:r>
+        <w:t>You save each source file in its language's section below, as each is shown, and step 4 types the TypeScript and vcpkg settings files. As in Chapter 1, notepad .\c\basic_server.c creates and opens one: choose Yes, type the file, save it with Ctrl+S, and close Notepad. On Linux, nano ./c/basic_server.c does the same: type the file, then save and close it with Ctrl+O, Enter, then Ctrl+X.</w:t>
       </w:r>
     </w:p>
     <w:p>
@@ -1774,22 +2097,276 @@
         <w:keepNext/>
       </w:pPr>
       <w:r>
-        <w:t>Back in PowerShell, in the lesson-6.0 folder. npm installs undici and the TypeScript compiler from package.json. curl.exe downloads cpp-httplib's one header from its 0.59.0 release, which the course moved to for its security fixes; remember, -fsSL fails on an error page, stays quiet except for errors, and follows redirects, and -o names the file to save (Lesson 2.17).</w:t>
-      </w:r>
-    </w:p>
-    <w:p>
-      <w:pPr>
-        <w:keepNext/>
-      </w:pPr>
-    </w:p>
-    <w:p>
-      <w:pPr>
-        <w:pStyle w:val="CommandBlock"/>
-        <w:keepNext/>
-      </w:pPr>
-      <w:r>
-        <w:t>npm --prefix .\typescript install --ignore-scripts --no-audit --no-fund</w:t>
-      </w:r>
+        <w:t>Back in PowerShell, in the lesson-6.0 folder. The TypeScript project needs a package.json. Remember, npm init -y, npm pkg, then npm install: npm init -y writes package.json inside .\typescript, npm pkg set and npm pkg delete shape its fields, and the npm install lines pin undici 8.11.2, which the client needs when it runs, then the TypeScript compiler and Node's type descriptions, which only the build needs (--save-dev). Pop-Location moves back to lesson-6.0. Then type the TypeScript compiler settings: note</w:t>
+      </w:r>
+      <w:r>
+        <w:t>pad .\typescript\tsconfig.json creates and opens the file; choose Yes, type the file, save it with Ctrl+S, and close Notepad.</w:t>
+      </w:r>
+    </w:p>
+    <w:p>
+      <w:pPr>
+        <w:keepNext/>
+      </w:pPr>
+    </w:p>
+    <w:p>
+      <w:pPr>
+        <w:pStyle w:val="CommandBlock"/>
+        <w:keepNext/>
+      </w:pPr>
+      <w:r>
+        <w:t>Push-Location .\typescript</w:t>
+      </w:r>
+    </w:p>
+    <w:p>
+      <w:pPr>
+        <w:pStyle w:val="CommandBlock"/>
+        <w:keepNext/>
+      </w:pPr>
+      <w:r>
+        <w:t>npm init -y</w:t>
+      </w:r>
+    </w:p>
+    <w:p>
+      <w:pPr>
+        <w:pStyle w:val="CommandBlock"/>
+        <w:keepNext/>
+      </w:pPr>
+      <w:r>
+        <w:t>npm pkg set name=api-setup-typescript type=module</w:t>
+      </w:r>
+    </w:p>
+    <w:p>
+      <w:pPr>
+        <w:pStyle w:val="CommandBlock"/>
+        <w:keepNext/>
+      </w:pPr>
+      <w:r>
+        <w:t>npm pkg set private=true --json</w:t>
+      </w:r>
+    </w:p>
+    <w:p>
+      <w:pPr>
+        <w:pStyle w:val="CommandBlock"/>
+        <w:keepNext/>
+      </w:pPr>
+      <w:r>
+        <w:t>npm pkg set "scripts.check=tsc --noEmit" "scripts.build=tsc --noEmitOnError"</w:t>
+      </w:r>
+    </w:p>
+    <w:p>
+      <w:pPr>
+        <w:pStyle w:val="CommandBlock"/>
+        <w:keepNext/>
+      </w:pPr>
+      <w:r>
+        <w:t>npm pkg delete version description main keywords author license scripts.test</w:t>
+      </w:r>
+    </w:p>
+    <w:p>
+      <w:pPr>
+        <w:pStyle w:val="CommandBlock"/>
+        <w:keepNext/>
+      </w:pPr>
+      <w:r>
+        <w:t>npm install --save-exact undici@8.11.2 --ignore-scripts --no-audit --no-fund</w:t>
+      </w:r>
+    </w:p>
+    <w:p>
+      <w:pPr>
+        <w:pStyle w:val="CommandBlock"/>
+        <w:keepNext/>
+      </w:pPr>
+      <w:r>
+        <w:t>npm install --save-dev --save-exact typescript@7.0.2 @types/node@24.13.5 `</w:t>
+      </w:r>
+    </w:p>
+    <w:p>
+      <w:pPr>
+        <w:pStyle w:val="CommandBlock"/>
+        <w:keepNext/>
+      </w:pPr>
+      <w:r>
+        <w:t xml:space="preserve">    --ignore-scripts --no-audit --no-fund</w:t>
+      </w:r>
+    </w:p>
+    <w:p>
+      <w:pPr>
+        <w:pStyle w:val="CommandBlock"/>
+      </w:pPr>
+      <w:r>
+        <w:t>Pop-Location</w:t>
+      </w:r>
+    </w:p>
+    <w:p>
+      <w:pPr>
+        <w:keepNext/>
+      </w:pPr>
+    </w:p>
+    <w:p>
+      <w:pPr>
+        <w:pStyle w:val="Heading3"/>
+      </w:pPr>
+      <w:r>
+        <w:t>typescript/tsconfig.json</w:t>
+      </w:r>
+    </w:p>
+    <w:p>
+      <w:pPr>
+        <w:pStyle w:val="SourceCode"/>
+        <w:keepNext/>
+      </w:pPr>
+      <w:r>
+        <w:t>{</w:t>
+      </w:r>
+    </w:p>
+    <w:p>
+      <w:pPr>
+        <w:pStyle w:val="SourceCode"/>
+        <w:keepNext/>
+      </w:pPr>
+      <w:r>
+        <w:t xml:space="preserve">  "compilerOptions": {</w:t>
+      </w:r>
+    </w:p>
+    <w:p>
+      <w:pPr>
+        <w:pStyle w:val="SourceCode"/>
+      </w:pPr>
+      <w:r>
+        <w:t xml:space="preserve">    "target": "ES2022",</w:t>
+      </w:r>
+    </w:p>
+    <w:p>
+      <w:pPr>
+        <w:pStyle w:val="SourceCode"/>
+      </w:pPr>
+      <w:r>
+        <w:t xml:space="preserve">    "module": "NodeNext",</w:t>
+      </w:r>
+    </w:p>
+    <w:p>
+      <w:pPr>
+        <w:pStyle w:val="SourceCode"/>
+      </w:pPr>
+      <w:r>
+        <w:t xml:space="preserve">    "moduleResolution": "NodeNext",</w:t>
+      </w:r>
+    </w:p>
+    <w:p>
+      <w:pPr>
+        <w:pStyle w:val="SourceCode"/>
+      </w:pPr>
+      <w:r>
+        <w:t xml:space="preserve">    "rootDir": "src",</w:t>
+      </w:r>
+    </w:p>
+    <w:p>
+      <w:pPr>
+        <w:pStyle w:val="SourceCode"/>
+      </w:pPr>
+      <w:r>
+        <w:t xml:space="preserve">    "outDir": "dist",</w:t>
+      </w:r>
+    </w:p>
+    <w:p>
+      <w:pPr>
+        <w:pStyle w:val="SourceCode"/>
+      </w:pPr>
+      <w:r>
+        <w:t xml:space="preserve">    "strict": true,</w:t>
+      </w:r>
+    </w:p>
+    <w:p>
+      <w:pPr>
+        <w:pStyle w:val="SourceCode"/>
+      </w:pPr>
+      <w:r>
+        <w:t xml:space="preserve">    "types": [</w:t>
+      </w:r>
+    </w:p>
+    <w:p>
+      <w:pPr>
+        <w:pStyle w:val="SourceCode"/>
+      </w:pPr>
+      <w:r>
+        <w:t xml:space="preserve">      "node"</w:t>
+      </w:r>
+    </w:p>
+    <w:p>
+      <w:pPr>
+        <w:pStyle w:val="SourceCode"/>
+      </w:pPr>
+      <w:r>
+        <w:t xml:space="preserve">    ],</w:t>
+      </w:r>
+    </w:p>
+    <w:p>
+      <w:pPr>
+        <w:pStyle w:val="SourceCode"/>
+      </w:pPr>
+      <w:r>
+        <w:t xml:space="preserve">    "moduleDetection": "force"</w:t>
+      </w:r>
+    </w:p>
+    <w:p>
+      <w:pPr>
+        <w:pStyle w:val="SourceCode"/>
+      </w:pPr>
+      <w:r>
+        <w:t xml:space="preserve">  },</w:t>
+      </w:r>
+    </w:p>
+    <w:p>
+      <w:pPr>
+        <w:pStyle w:val="SourceCode"/>
+      </w:pPr>
+      <w:r>
+        <w:t xml:space="preserve">  "include": [</w:t>
+      </w:r>
+    </w:p>
+    <w:p>
+      <w:pPr>
+        <w:pStyle w:val="SourceCode"/>
+        <w:keepNext/>
+      </w:pPr>
+      <w:r>
+        <w:t xml:space="preserve">    "src/**/*.ts"</w:t>
+      </w:r>
+    </w:p>
+    <w:p>
+      <w:pPr>
+        <w:pStyle w:val="SourceCode"/>
+        <w:keepNext/>
+      </w:pPr>
+      <w:r>
+        <w:t xml:space="preserve">  ]</w:t>
+      </w:r>
+    </w:p>
+    <w:p>
+      <w:pPr>
+        <w:pStyle w:val="SourceCode"/>
+      </w:pPr>
+      <w:r>
+        <w:t>}</w:t>
+      </w:r>
+    </w:p>
+    <w:p>
+      <w:pPr>
+        <w:keepNext/>
+      </w:pPr>
+    </w:p>
+    <w:p>
+      <w:pPr>
+        <w:keepNext/>
+      </w:pPr>
+      <w:r>
+        <w:t>Next, curl.exe downloads cpp-httplib's one header from its 0.59.0 release, which the course moved to for its security fixes; remember, -fsSL fails on an error page, stays quiet except for errors, and follows redirects, and -o names the file to save (Lesson 2.17).</w:t>
+      </w:r>
+    </w:p>
+    <w:p>
+      <w:pPr>
+        <w:keepNext/>
+      </w:pPr>
     </w:p>
     <w:p>
       <w:pPr>
@@ -1822,14 +2399,168 @@
       </w:r>
     </w:p>
     <w:p>
-      <w:pPr>
-        <w:keepNext/>
-      </w:pPr>
       <w:r>
         <w:t xml:space="preserve">The C++ programs need OpenSSL built with Visual C++. vcpkg, Microsoft's C and C++ package manager, comes with the Build Tools and is on PATH in the Developer PowerShell that Launch-VsDevShell starts. .\cpp\vcpkg.json names the one package the project needs, openssl, and pins it with an override to version 3.5.4, and .\cpp\vcpkg-configuration.json pins the exact version of vcpkg's package list, so every learner builds the same OpenSSL. 3.5 is OpenSSL's long-term support (LTS) line, which gets security fixes </w:t>
       </w:r>
       <w:r>
-        <w:t>until 2030, while a non-LTS line such as 3.6 loses support within about a year; a library that every later lesson copies should stay supported. vcpkg's 3.5 line stops at 3.5.4. OpenSSL's later 3.5 releases fix parts these servers do not use (CMS, PKCS7, PKCS12, QUIC and DTLS), so the course stays on vcpkg's 3.5.4 build until vcpkg ships a newer 3.5 release. vcpkg install reads both, downloads OpenSSL's source, and builds it into .\cpp\vcpkg_installed; it takes a few minutes the first time.</w:t>
+        <w:t>until 2030, while a non-LTS line such as 3.6 loses support within about a year; a library that every later lesson copies should stay supported. vcpkg's 3.5 line stops at 3.5.4. OpenSSL's later 3.5 releases fix parts these servers do not use (CMS, PKCS7, PKCS12, QUIC and DTLS), so the course stays on vcpkg's 3.5.4 build until vcpkg ships a newer 3.5 release. vcpkg install reads both, downloads OpenSSL's source, and builds it into .\cpp\vcpkg_installed; it takes a few minutes the first time. Type both files f</w:t>
+      </w:r>
+      <w:r>
+        <w:t>irst: notepad .\cpp\vcpkg.json creates and opens one; choose Yes, type the file, save it with Ctrl+S, and close Notepad. vcpkg.json lists openssl and its override, version 3.5.4, and vcpkg-configuration.json pins the commit of vcpkg's package list, the baseline, that fixes OpenSSL's version.</w:t>
+      </w:r>
+    </w:p>
+    <w:p>
+      <w:pPr>
+        <w:keepNext/>
+      </w:pPr>
+    </w:p>
+    <w:p>
+      <w:pPr>
+        <w:pStyle w:val="Heading3"/>
+      </w:pPr>
+      <w:r>
+        <w:t>cpp/vcpkg.json</w:t>
+      </w:r>
+    </w:p>
+    <w:p>
+      <w:pPr>
+        <w:pStyle w:val="SourceCode"/>
+        <w:keepNext/>
+      </w:pPr>
+      <w:r>
+        <w:t>{</w:t>
+      </w:r>
+    </w:p>
+    <w:p>
+      <w:pPr>
+        <w:pStyle w:val="SourceCode"/>
+        <w:keepNext/>
+      </w:pPr>
+      <w:r>
+        <w:t xml:space="preserve">  "dependencies": ["openssl"],</w:t>
+      </w:r>
+    </w:p>
+    <w:p>
+      <w:pPr>
+        <w:pStyle w:val="SourceCode"/>
+        <w:keepNext/>
+      </w:pPr>
+      <w:r>
+        <w:t xml:space="preserve">  "overrides": [</w:t>
+      </w:r>
+    </w:p>
+    <w:p>
+      <w:pPr>
+        <w:pStyle w:val="SourceCode"/>
+        <w:keepNext/>
+      </w:pPr>
+      <w:r>
+        <w:t xml:space="preserve">    { "name": "openssl", "version": "3.5.4" }</w:t>
+      </w:r>
+    </w:p>
+    <w:p>
+      <w:pPr>
+        <w:pStyle w:val="SourceCode"/>
+        <w:keepNext/>
+      </w:pPr>
+      <w:r>
+        <w:t xml:space="preserve">  ]</w:t>
+      </w:r>
+    </w:p>
+    <w:p>
+      <w:pPr>
+        <w:pStyle w:val="SourceCode"/>
+      </w:pPr>
+      <w:r>
+        <w:t>}</w:t>
+      </w:r>
+    </w:p>
+    <w:p>
+      <w:pPr>
+        <w:keepNext/>
+      </w:pPr>
+    </w:p>
+    <w:p>
+      <w:pPr>
+        <w:pStyle w:val="Heading3"/>
+      </w:pPr>
+      <w:r>
+        <w:t>cpp/vcpkg-configuration.json</w:t>
+      </w:r>
+    </w:p>
+    <w:p>
+      <w:pPr>
+        <w:pStyle w:val="SourceCode"/>
+        <w:keepNext/>
+      </w:pPr>
+      <w:r>
+        <w:t>{</w:t>
+      </w:r>
+    </w:p>
+    <w:p>
+      <w:pPr>
+        <w:pStyle w:val="SourceCode"/>
+        <w:keepNext/>
+      </w:pPr>
+      <w:r>
+        <w:t xml:space="preserve">  "default-registry": {</w:t>
+      </w:r>
+    </w:p>
+    <w:p>
+      <w:pPr>
+        <w:pStyle w:val="SourceCode"/>
+        <w:keepNext/>
+      </w:pPr>
+      <w:r>
+        <w:t xml:space="preserve">    "kind": "git",</w:t>
+      </w:r>
+    </w:p>
+    <w:p>
+      <w:pPr>
+        <w:pStyle w:val="SourceCode"/>
+        <w:keepNext/>
+      </w:pPr>
+      <w:r>
+        <w:t xml:space="preserve">    "baseline": "e03dc9b29710050cd1018bc5674688108658d327",</w:t>
+      </w:r>
+    </w:p>
+    <w:p>
+      <w:pPr>
+        <w:pStyle w:val="SourceCode"/>
+        <w:keepNext/>
+      </w:pPr>
+      <w:r>
+        <w:t xml:space="preserve">    "repository": "https://github.com/microsoft/vcpkg"</w:t>
+      </w:r>
+    </w:p>
+    <w:p>
+      <w:pPr>
+        <w:pStyle w:val="SourceCode"/>
+        <w:keepNext/>
+      </w:pPr>
+      <w:r>
+        <w:t xml:space="preserve">  }</w:t>
+      </w:r>
+    </w:p>
+    <w:p>
+      <w:pPr>
+        <w:pStyle w:val="SourceCode"/>
+      </w:pPr>
+      <w:r>
+        <w:t>}</w:t>
+      </w:r>
+    </w:p>
+    <w:p>
+      <w:pPr>
+        <w:keepNext/>
+      </w:pPr>
+    </w:p>
+    <w:p>
+      <w:pPr>
+        <w:keepNext/>
+      </w:pPr>
+      <w:r>
+        <w:t>Then build OpenSSL:</w:t>
       </w:r>
     </w:p>
     <w:p>
@@ -2109,21 +2840,102 @@
         <w:keepNext/>
       </w:pPr>
       <w:r>
-        <w:t>The C and C++ sections name each language's Linux and macOS packages. The rest is the same:</w:t>
-      </w:r>
-    </w:p>
-    <w:p>
-      <w:pPr>
-        <w:keepNext/>
-      </w:pPr>
-    </w:p>
-    <w:p>
-      <w:pPr>
-        <w:pStyle w:val="CommandBlock"/>
-        <w:keepNext/>
-      </w:pPr>
-      <w:r>
-        <w:t>npm --prefix ./typescript install --ignore-scripts --no-audit --no-fund</w:t>
+        <w:t>The C and C++ sections name each language's Linux and macOS packages. The rest is the same; cd moves into ./typescript for the npm lines, and cd .. moves back. Type typescript/tsconfig.json exactly as shown in the Windows setup.</w:t>
+      </w:r>
+    </w:p>
+    <w:p>
+      <w:pPr>
+        <w:keepNext/>
+      </w:pPr>
+    </w:p>
+    <w:p>
+      <w:pPr>
+        <w:pStyle w:val="CommandBlock"/>
+        <w:keepNext/>
+      </w:pPr>
+      <w:r>
+        <w:t>cd ./typescript</w:t>
+      </w:r>
+    </w:p>
+    <w:p>
+      <w:pPr>
+        <w:pStyle w:val="CommandBlock"/>
+        <w:keepNext/>
+      </w:pPr>
+      <w:r>
+        <w:t>npm init -y</w:t>
+      </w:r>
+    </w:p>
+    <w:p>
+      <w:pPr>
+        <w:pStyle w:val="CommandBlock"/>
+        <w:keepNext/>
+      </w:pPr>
+      <w:r>
+        <w:t>npm pkg set name=api-setup-typescript type=module</w:t>
+      </w:r>
+    </w:p>
+    <w:p>
+      <w:pPr>
+        <w:pStyle w:val="CommandBlock"/>
+        <w:keepNext/>
+      </w:pPr>
+      <w:r>
+        <w:t>npm pkg set private=true --json</w:t>
+      </w:r>
+    </w:p>
+    <w:p>
+      <w:pPr>
+        <w:pStyle w:val="CommandBlock"/>
+        <w:keepNext/>
+      </w:pPr>
+      <w:r>
+        <w:t>npm pkg set "scripts.check=tsc --noEmit" "scripts.build=tsc --noEmitOnError"</w:t>
+      </w:r>
+    </w:p>
+    <w:p>
+      <w:pPr>
+        <w:pStyle w:val="CommandBlock"/>
+        <w:keepNext/>
+      </w:pPr>
+      <w:r>
+        <w:t>npm pkg delete version description main keywords author license scripts.test</w:t>
+      </w:r>
+    </w:p>
+    <w:p>
+      <w:pPr>
+        <w:pStyle w:val="CommandBlock"/>
+        <w:keepNext/>
+      </w:pPr>
+      <w:r>
+        <w:t>npm install --save-exact undici@8.11.2 --ignore-scripts --no-audit --no-fund</w:t>
+      </w:r>
+    </w:p>
+    <w:p>
+      <w:pPr>
+        <w:pStyle w:val="CommandBlock"/>
+        <w:keepNext/>
+      </w:pPr>
+      <w:r>
+        <w:t>npm install --save-dev --save-exact typescript@7.0.2 @types/node@24.13.5 \</w:t>
+      </w:r>
+    </w:p>
+    <w:p>
+      <w:pPr>
+        <w:pStyle w:val="CommandBlock"/>
+        <w:keepNext/>
+      </w:pPr>
+      <w:r>
+        <w:t xml:space="preserve">    --ignore-scripts --no-audit --no-fund</w:t>
+      </w:r>
+    </w:p>
+    <w:p>
+      <w:pPr>
+        <w:pStyle w:val="CommandBlock"/>
+        <w:keepNext/>
+      </w:pPr>
+      <w:r>
+        <w:t>cd ..</w:t>
       </w:r>
     </w:p>
     <w:p>
@@ -21535,10 +22347,7 @@
     </w:p>
     <w:p>
       <w:r>
-        <w:t>These files follow the same pattern as the earlier lessons. Remember, a project file pins each package to one version (Lesson 2.17). Each server's .csproj uses Microsoft.NET.Sdk.Web and sets RunWorkingDirectory, which the C# What to Notice explains; the client projects use the plain Microsoft.NET.Sdk. go.mod names this lesson's Go module, example.com/apisetup, and requires nothing: everything comes from the standard library. package.json names undici 8.11.2 under dependencies. vcpkg.json lists openssl and i</w:t>
-      </w:r>
-      <w:r>
-        <w:t>ts override, version 3.5.4, and vcpkg-configuration.json pins the commit of vcpkg's package list, the baseline, that fixes OpenSSL's version.</w:t>
+        <w:t>These are the files the setup commands wrote, shown here so you can check yours. Your go line shows your own Go version, and the blank lines and the order of the package.json fields may differ. The client projects use the plain Microsoft.NET.Sdk. go.mod names this lesson's Go module, example.com/apisetup, and requires nothing: everything comes from the standard library. package.json names undici 8.11.2 under dependencies.</w:t>
       </w:r>
     </w:p>
     <w:p>
@@ -21556,16 +22365,16 @@
         <w:pStyle w:val="Heading2"/>
       </w:pPr>
       <w:r>
-        <w:t>csharp/BasicServer/BasicServer.csproj</w:t>
-      </w:r>
-    </w:p>
-    <w:p>
-      <w:pPr>
-        <w:pStyle w:val="SourceCode"/>
-        <w:keepNext/>
-      </w:pPr>
-      <w:r>
-        <w:t>&lt;Project Sdk="Microsoft.NET.Sdk.Web"&gt;</w:t>
+        <w:t>csharp/BasicClient/BasicClient.csproj</w:t>
+      </w:r>
+    </w:p>
+    <w:p>
+      <w:pPr>
+        <w:pStyle w:val="SourceCode"/>
+        <w:keepNext/>
+      </w:pPr>
+      <w:r>
+        <w:t>&lt;Project Sdk="Microsoft.NET.Sdk"&gt;</w:t>
       </w:r>
     </w:p>
     <w:p>
@@ -21619,15 +22428,6 @@
         <w:keepNext/>
       </w:pPr>
       <w:r>
-        <w:t xml:space="preserve">    &lt;RunWorkingDirectory&gt;$(MSBuildStartupDirectory)&lt;/RunWorkingDirectory&gt;</w:t>
-      </w:r>
-    </w:p>
-    <w:p>
-      <w:pPr>
-        <w:pStyle w:val="SourceCode"/>
-        <w:keepNext/>
-      </w:pPr>
-      <w:r>
         <w:t xml:space="preserve">  &lt;/PropertyGroup&gt;</w:t>
       </w:r>
     </w:p>
@@ -21654,7 +22454,7 @@
         <w:pStyle w:val="Heading2"/>
       </w:pPr>
       <w:r>
-        <w:t>csharp/BasicClient/BasicClient.csproj</w:t>
+        <w:t>csharp/Client/Client.csproj</w:t>
       </w:r>
     </w:p>
     <w:p>
@@ -21743,87 +22543,30 @@
         <w:pStyle w:val="Heading2"/>
       </w:pPr>
       <w:r>
-        <w:t>csharp/Server/Server.csproj</w:t>
-      </w:r>
-    </w:p>
-    <w:p>
-      <w:pPr>
-        <w:pStyle w:val="SourceCode"/>
-        <w:keepNext/>
-      </w:pPr>
-      <w:r>
-        <w:t>&lt;Project Sdk="Microsoft.NET.Sdk.Web"&gt;</w:t>
-      </w:r>
-    </w:p>
-    <w:p>
-      <w:pPr>
-        <w:pStyle w:val="SourceCode"/>
-        <w:keepNext/>
-      </w:pPr>
-      <w:r>
-        <w:t xml:space="preserve">  &lt;PropertyGroup&gt;</w:t>
-      </w:r>
-    </w:p>
-    <w:p>
-      <w:pPr>
-        <w:pStyle w:val="SourceCode"/>
-        <w:keepNext/>
-      </w:pPr>
-      <w:r>
-        <w:t xml:space="preserve">    &lt;OutputType&gt;Exe&lt;/OutputType&gt;</w:t>
-      </w:r>
-    </w:p>
-    <w:p>
-      <w:pPr>
-        <w:pStyle w:val="SourceCode"/>
-        <w:keepNext/>
-      </w:pPr>
-      <w:r>
-        <w:t xml:space="preserve">    &lt;TargetFramework&gt;net10.0&lt;/TargetFramework&gt;</w:t>
-      </w:r>
-    </w:p>
-    <w:p>
-      <w:pPr>
-        <w:pStyle w:val="SourceCode"/>
-        <w:keepNext/>
-      </w:pPr>
-      <w:r>
-        <w:t xml:space="preserve">    &lt;ImplicitUsings&gt;enable&lt;/ImplicitUsings&gt;</w:t>
-      </w:r>
-    </w:p>
-    <w:p>
-      <w:pPr>
-        <w:pStyle w:val="SourceCode"/>
-        <w:keepNext/>
-      </w:pPr>
-      <w:r>
-        <w:t xml:space="preserve">    &lt;Nullable&gt;enable&lt;/Nullable&gt;</w:t>
-      </w:r>
-    </w:p>
-    <w:p>
-      <w:pPr>
-        <w:pStyle w:val="SourceCode"/>
-        <w:keepNext/>
-      </w:pPr>
-      <w:r>
-        <w:t xml:space="preserve">    &lt;RunWorkingDirectory&gt;$(MSBuildStartupDirectory)&lt;/RunWorkingDirectory&gt;</w:t>
-      </w:r>
-    </w:p>
-    <w:p>
-      <w:pPr>
-        <w:pStyle w:val="SourceCode"/>
-        <w:keepNext/>
-      </w:pPr>
-      <w:r>
-        <w:t xml:space="preserve">  &lt;/PropertyGroup&gt;</w:t>
-      </w:r>
-    </w:p>
-    <w:p>
-      <w:pPr>
-        <w:pStyle w:val="SourceCode"/>
-      </w:pPr>
-      <w:r>
-        <w:t>&lt;/Project&gt;</w:t>
+        <w:t>go/go.mod</w:t>
+      </w:r>
+    </w:p>
+    <w:p>
+      <w:pPr>
+        <w:pStyle w:val="SourceCode"/>
+        <w:keepNext/>
+      </w:pPr>
+      <w:r>
+        <w:t>module example.com/apisetup</w:t>
+      </w:r>
+    </w:p>
+    <w:p>
+      <w:pPr>
+        <w:pStyle w:val="SourceCode"/>
+        <w:keepNext/>
+      </w:pPr>
+    </w:p>
+    <w:p>
+      <w:pPr>
+        <w:pStyle w:val="SourceCode"/>
+      </w:pPr>
+      <w:r>
+        <w:t>go 1.24.0</w:t>
       </w:r>
     </w:p>
     <w:p>
@@ -21841,136 +22584,6 @@
         <w:pStyle w:val="Heading2"/>
       </w:pPr>
       <w:r>
-        <w:t>csharp/Client/Client.csproj</w:t>
-      </w:r>
-    </w:p>
-    <w:p>
-      <w:pPr>
-        <w:pStyle w:val="SourceCode"/>
-        <w:keepNext/>
-      </w:pPr>
-      <w:r>
-        <w:t>&lt;Project Sdk="Microsoft.NET.Sdk"&gt;</w:t>
-      </w:r>
-    </w:p>
-    <w:p>
-      <w:pPr>
-        <w:pStyle w:val="SourceCode"/>
-        <w:keepNext/>
-      </w:pPr>
-      <w:r>
-        <w:t xml:space="preserve">  &lt;PropertyGroup&gt;</w:t>
-      </w:r>
-    </w:p>
-    <w:p>
-      <w:pPr>
-        <w:pStyle w:val="SourceCode"/>
-        <w:keepNext/>
-      </w:pPr>
-      <w:r>
-        <w:t xml:space="preserve">    &lt;OutputType&gt;Exe&lt;/OutputType&gt;</w:t>
-      </w:r>
-    </w:p>
-    <w:p>
-      <w:pPr>
-        <w:pStyle w:val="SourceCode"/>
-        <w:keepNext/>
-      </w:pPr>
-      <w:r>
-        <w:t xml:space="preserve">    &lt;TargetFramework&gt;net10.0&lt;/TargetFramework&gt;</w:t>
-      </w:r>
-    </w:p>
-    <w:p>
-      <w:pPr>
-        <w:pStyle w:val="SourceCode"/>
-        <w:keepNext/>
-      </w:pPr>
-      <w:r>
-        <w:t xml:space="preserve">    &lt;ImplicitUsings&gt;enable&lt;/ImplicitUsings&gt;</w:t>
-      </w:r>
-    </w:p>
-    <w:p>
-      <w:pPr>
-        <w:pStyle w:val="SourceCode"/>
-        <w:keepNext/>
-      </w:pPr>
-      <w:r>
-        <w:t xml:space="preserve">    &lt;Nullable&gt;enable&lt;/Nullable&gt;</w:t>
-      </w:r>
-    </w:p>
-    <w:p>
-      <w:pPr>
-        <w:pStyle w:val="SourceCode"/>
-        <w:keepNext/>
-      </w:pPr>
-      <w:r>
-        <w:t xml:space="preserve">  &lt;/PropertyGroup&gt;</w:t>
-      </w:r>
-    </w:p>
-    <w:p>
-      <w:pPr>
-        <w:pStyle w:val="SourceCode"/>
-      </w:pPr>
-      <w:r>
-        <w:t>&lt;/Project&gt;</w:t>
-      </w:r>
-    </w:p>
-    <w:p>
-      <w:pPr>
-        <w:keepNext/>
-      </w:pPr>
-    </w:p>
-    <w:p>
-      <w:pPr>
-        <w:keepNext/>
-      </w:pPr>
-    </w:p>
-    <w:p>
-      <w:pPr>
-        <w:pStyle w:val="Heading2"/>
-      </w:pPr>
-      <w:r>
-        <w:t>go/go.mod</w:t>
-      </w:r>
-    </w:p>
-    <w:p>
-      <w:pPr>
-        <w:pStyle w:val="SourceCode"/>
-        <w:keepNext/>
-      </w:pPr>
-      <w:r>
-        <w:t>module example.com/apisetup</w:t>
-      </w:r>
-    </w:p>
-    <w:p>
-      <w:pPr>
-        <w:pStyle w:val="SourceCode"/>
-        <w:keepNext/>
-      </w:pPr>
-    </w:p>
-    <w:p>
-      <w:pPr>
-        <w:pStyle w:val="SourceCode"/>
-      </w:pPr>
-      <w:r>
-        <w:t>go 1.24.0</w:t>
-      </w:r>
-    </w:p>
-    <w:p>
-      <w:pPr>
-        <w:keepNext/>
-      </w:pPr>
-    </w:p>
-    <w:p>
-      <w:pPr>
-        <w:keepNext/>
-      </w:pPr>
-    </w:p>
-    <w:p>
-      <w:pPr>
-        <w:pStyle w:val="Heading2"/>
-      </w:pPr>
-      <w:r>
         <w:t>typescript/package.json</w:t>
       </w:r>
     </w:p>
@@ -22087,315 +22700,6 @@
       </w:pPr>
       <w:r>
         <w:t xml:space="preserve">    "typescript": "7.0.2"</w:t>
-      </w:r>
-    </w:p>
-    <w:p>
-      <w:pPr>
-        <w:pStyle w:val="SourceCode"/>
-        <w:keepNext/>
-      </w:pPr>
-      <w:r>
-        <w:t xml:space="preserve">  }</w:t>
-      </w:r>
-    </w:p>
-    <w:p>
-      <w:pPr>
-        <w:pStyle w:val="SourceCode"/>
-      </w:pPr>
-      <w:r>
-        <w:t>}</w:t>
-      </w:r>
-    </w:p>
-    <w:p>
-      <w:pPr>
-        <w:keepNext/>
-      </w:pPr>
-    </w:p>
-    <w:p>
-      <w:pPr>
-        <w:keepNext/>
-      </w:pPr>
-    </w:p>
-    <w:p>
-      <w:pPr>
-        <w:pStyle w:val="Heading2"/>
-      </w:pPr>
-      <w:r>
-        <w:t>typescript/tsconfig.json</w:t>
-      </w:r>
-    </w:p>
-    <w:p>
-      <w:pPr>
-        <w:pStyle w:val="SourceCode"/>
-        <w:keepNext/>
-      </w:pPr>
-      <w:r>
-        <w:t>{</w:t>
-      </w:r>
-    </w:p>
-    <w:p>
-      <w:pPr>
-        <w:pStyle w:val="SourceCode"/>
-        <w:keepNext/>
-      </w:pPr>
-      <w:r>
-        <w:t xml:space="preserve">  "compilerOptions": {</w:t>
-      </w:r>
-    </w:p>
-    <w:p>
-      <w:pPr>
-        <w:pStyle w:val="SourceCode"/>
-      </w:pPr>
-      <w:r>
-        <w:t xml:space="preserve">    "target": "ES2022",</w:t>
-      </w:r>
-    </w:p>
-    <w:p>
-      <w:pPr>
-        <w:pStyle w:val="SourceCode"/>
-      </w:pPr>
-      <w:r>
-        <w:t xml:space="preserve">    "module": "NodeNext",</w:t>
-      </w:r>
-    </w:p>
-    <w:p>
-      <w:pPr>
-        <w:pStyle w:val="SourceCode"/>
-      </w:pPr>
-      <w:r>
-        <w:t xml:space="preserve">    "moduleResolution": "NodeNext",</w:t>
-      </w:r>
-    </w:p>
-    <w:p>
-      <w:pPr>
-        <w:pStyle w:val="SourceCode"/>
-      </w:pPr>
-      <w:r>
-        <w:t xml:space="preserve">    "rootDir": "src",</w:t>
-      </w:r>
-    </w:p>
-    <w:p>
-      <w:pPr>
-        <w:pStyle w:val="SourceCode"/>
-      </w:pPr>
-      <w:r>
-        <w:t xml:space="preserve">    "outDir": "dist",</w:t>
-      </w:r>
-    </w:p>
-    <w:p>
-      <w:pPr>
-        <w:pStyle w:val="SourceCode"/>
-      </w:pPr>
-      <w:r>
-        <w:t xml:space="preserve">    "strict": true,</w:t>
-      </w:r>
-    </w:p>
-    <w:p>
-      <w:pPr>
-        <w:pStyle w:val="SourceCode"/>
-      </w:pPr>
-      <w:r>
-        <w:t xml:space="preserve">    "types": [</w:t>
-      </w:r>
-    </w:p>
-    <w:p>
-      <w:pPr>
-        <w:pStyle w:val="SourceCode"/>
-      </w:pPr>
-      <w:r>
-        <w:t xml:space="preserve">      "node"</w:t>
-      </w:r>
-    </w:p>
-    <w:p>
-      <w:pPr>
-        <w:pStyle w:val="SourceCode"/>
-      </w:pPr>
-      <w:r>
-        <w:t xml:space="preserve">    ],</w:t>
-      </w:r>
-    </w:p>
-    <w:p>
-      <w:pPr>
-        <w:pStyle w:val="SourceCode"/>
-      </w:pPr>
-      <w:r>
-        <w:t xml:space="preserve">    "moduleDetection": "force"</w:t>
-      </w:r>
-    </w:p>
-    <w:p>
-      <w:pPr>
-        <w:pStyle w:val="SourceCode"/>
-      </w:pPr>
-      <w:r>
-        <w:t xml:space="preserve">  },</w:t>
-      </w:r>
-    </w:p>
-    <w:p>
-      <w:pPr>
-        <w:pStyle w:val="SourceCode"/>
-      </w:pPr>
-      <w:r>
-        <w:t xml:space="preserve">  "include": [</w:t>
-      </w:r>
-    </w:p>
-    <w:p>
-      <w:pPr>
-        <w:pStyle w:val="SourceCode"/>
-        <w:keepNext/>
-      </w:pPr>
-      <w:r>
-        <w:t xml:space="preserve">    "src/**/*.ts"</w:t>
-      </w:r>
-    </w:p>
-    <w:p>
-      <w:pPr>
-        <w:pStyle w:val="SourceCode"/>
-        <w:keepNext/>
-      </w:pPr>
-      <w:r>
-        <w:t xml:space="preserve">  ]</w:t>
-      </w:r>
-    </w:p>
-    <w:p>
-      <w:pPr>
-        <w:pStyle w:val="SourceCode"/>
-      </w:pPr>
-      <w:r>
-        <w:t>}</w:t>
-      </w:r>
-    </w:p>
-    <w:p>
-      <w:pPr>
-        <w:keepNext/>
-      </w:pPr>
-    </w:p>
-    <w:p>
-      <w:pPr>
-        <w:keepNext/>
-      </w:pPr>
-    </w:p>
-    <w:p>
-      <w:pPr>
-        <w:pStyle w:val="Heading2"/>
-      </w:pPr>
-      <w:r>
-        <w:t>cpp/vcpkg.json</w:t>
-      </w:r>
-    </w:p>
-    <w:p>
-      <w:pPr>
-        <w:pStyle w:val="SourceCode"/>
-        <w:keepNext/>
-      </w:pPr>
-      <w:r>
-        <w:t>{</w:t>
-      </w:r>
-    </w:p>
-    <w:p>
-      <w:pPr>
-        <w:pStyle w:val="SourceCode"/>
-        <w:keepNext/>
-      </w:pPr>
-      <w:r>
-        <w:t xml:space="preserve">  "dependencies": ["openssl"],</w:t>
-      </w:r>
-    </w:p>
-    <w:p>
-      <w:pPr>
-        <w:pStyle w:val="SourceCode"/>
-        <w:keepNext/>
-      </w:pPr>
-      <w:r>
-        <w:t xml:space="preserve">  "overrides": [</w:t>
-      </w:r>
-    </w:p>
-    <w:p>
-      <w:pPr>
-        <w:pStyle w:val="SourceCode"/>
-        <w:keepNext/>
-      </w:pPr>
-      <w:r>
-        <w:t xml:space="preserve">    { "name": "openssl", "version": "3.5.4" }</w:t>
-      </w:r>
-    </w:p>
-    <w:p>
-      <w:pPr>
-        <w:pStyle w:val="SourceCode"/>
-        <w:keepNext/>
-      </w:pPr>
-      <w:r>
-        <w:t xml:space="preserve">  ]</w:t>
-      </w:r>
-    </w:p>
-    <w:p>
-      <w:pPr>
-        <w:pStyle w:val="SourceCode"/>
-      </w:pPr>
-      <w:r>
-        <w:t>}</w:t>
-      </w:r>
-    </w:p>
-    <w:p>
-      <w:pPr>
-        <w:keepNext/>
-      </w:pPr>
-    </w:p>
-    <w:p>
-      <w:pPr>
-        <w:keepNext/>
-      </w:pPr>
-    </w:p>
-    <w:p>
-      <w:pPr>
-        <w:pStyle w:val="Heading2"/>
-      </w:pPr>
-      <w:r>
-        <w:t>cpp/vcpkg-configuration.json</w:t>
-      </w:r>
-    </w:p>
-    <w:p>
-      <w:pPr>
-        <w:pStyle w:val="SourceCode"/>
-        <w:keepNext/>
-      </w:pPr>
-      <w:r>
-        <w:t>{</w:t>
-      </w:r>
-    </w:p>
-    <w:p>
-      <w:pPr>
-        <w:pStyle w:val="SourceCode"/>
-        <w:keepNext/>
-      </w:pPr>
-      <w:r>
-        <w:t xml:space="preserve">  "default-registry": {</w:t>
-      </w:r>
-    </w:p>
-    <w:p>
-      <w:pPr>
-        <w:pStyle w:val="SourceCode"/>
-        <w:keepNext/>
-      </w:pPr>
-      <w:r>
-        <w:t xml:space="preserve">    "kind": "git",</w:t>
-      </w:r>
-    </w:p>
-    <w:p>
-      <w:pPr>
-        <w:pStyle w:val="SourceCode"/>
-        <w:keepNext/>
-      </w:pPr>
-      <w:r>
-        <w:t xml:space="preserve">    "baseline": "e03dc9b29710050cd1018bc5674688108658d327",</w:t>
-      </w:r>
-    </w:p>
-    <w:p>
-      <w:pPr>
-        <w:pStyle w:val="SourceCode"/>
-        <w:keepNext/>
-      </w:pPr>
-      <w:r>
-        <w:t xml:space="preserve">    "repository": "https://github.com/microsoft/vcpkg"</w:t>
       </w:r>
     </w:p>
     <w:p>
@@ -23442,31 +23746,31 @@
       </w:rPr>
     </w:lvl>
   </w:abstractNum>
-  <w:num w:numId="1" w16cid:durableId="1021199977">
+  <w:num w:numId="1" w16cid:durableId="1898122487">
     <w:abstractNumId w:val="8"/>
   </w:num>
-  <w:num w:numId="2" w16cid:durableId="1147015183">
+  <w:num w:numId="2" w16cid:durableId="1912160166">
     <w:abstractNumId w:val="6"/>
   </w:num>
-  <w:num w:numId="3" w16cid:durableId="247233195">
+  <w:num w:numId="3" w16cid:durableId="799301828">
     <w:abstractNumId w:val="5"/>
   </w:num>
-  <w:num w:numId="4" w16cid:durableId="331181039">
+  <w:num w:numId="4" w16cid:durableId="826046436">
     <w:abstractNumId w:val="4"/>
   </w:num>
-  <w:num w:numId="5" w16cid:durableId="786238219">
+  <w:num w:numId="5" w16cid:durableId="159004587">
     <w:abstractNumId w:val="7"/>
   </w:num>
-  <w:num w:numId="6" w16cid:durableId="1797794104">
+  <w:num w:numId="6" w16cid:durableId="1371955624">
     <w:abstractNumId w:val="3"/>
   </w:num>
-  <w:num w:numId="7" w16cid:durableId="899250850">
+  <w:num w:numId="7" w16cid:durableId="1377118000">
     <w:abstractNumId w:val="2"/>
   </w:num>
-  <w:num w:numId="8" w16cid:durableId="281807565">
+  <w:num w:numId="8" w16cid:durableId="1263948908">
     <w:abstractNumId w:val="1"/>
   </w:num>
-  <w:num w:numId="9" w16cid:durableId="18548141">
+  <w:num w:numId="9" w16cid:durableId="198973537">
     <w:abstractNumId w:val="0"/>
   </w:num>
 </w:numbering>

</xml_diff>

<commit_message>
Volume 1, Chapter 6: updated lessons
</commit_message>
<xml_diff>
--- a/Volume 1/Chapter 06 - RESTful APIs/SPA_Vol1_Ch6_Lesson6_0_API_Setup.docx
+++ b/Volume 1/Chapter 06 - RESTful APIs/SPA_Vol1_Ch6_Lesson6_0_API_Setup.docx
@@ -608,6 +608,7 @@
         <w:pStyle w:val="CommandBlock"/>
       </w:pPr>
       <w:r>
+        <w:lastRenderedPageBreak/>
         <w:t xml:space="preserve">  cpp/server.cpp</w:t>
       </w:r>
     </w:p>
@@ -3215,7 +3216,7 @@
         <w:pStyle w:val="SourceCode"/>
       </w:pPr>
       <w:r>
-        <w:t>// the file cannot be opened or does not fit.</w:t>
+        <w:t>// it cannot be opened or does not fit. Remember, feof: the end was reached.</w:t>
       </w:r>
     </w:p>
     <w:p>
@@ -3513,15 +3514,15 @@
         <w:pStyle w:val="SourceCode"/>
       </w:pPr>
       <w:r>
-        <w:t xml:space="preserve">    // A response is a status, headers, and a body. _static means the body</w:t>
-      </w:r>
-    </w:p>
-    <w:p>
-      <w:pPr>
-        <w:pStyle w:val="SourceCode"/>
-      </w:pPr>
-      <w:r>
-        <w:t xml:space="preserve">    // is text that lives as long as the program, such as a string literal.</w:t>
+        <w:t xml:space="preserve">    // A response: status, headers, body. _static: the text lasts as long as</w:t>
+      </w:r>
+    </w:p>
+    <w:p>
+      <w:pPr>
+        <w:pStyle w:val="SourceCode"/>
+      </w:pPr>
+      <w:r>
+        <w:t xml:space="preserve">    // the program. The queue holds it until it is sent; destroy drops our hold.</w:t>
       </w:r>
     </w:p>
     <w:p>
@@ -3707,23 +3708,23 @@
         <w:pStyle w:val="SourceCode"/>
       </w:pPr>
       <w:r>
-        <w:t xml:space="preserve">    // can reach the server. sockaddr_in is the sockets library's record for</w:t>
-      </w:r>
-    </w:p>
-    <w:p>
-      <w:pPr>
-        <w:pStyle w:val="SourceCode"/>
-      </w:pPr>
-      <w:r>
-        <w:t xml:space="preserve">    // an IPv4 address and a port (Volume 3 teaches sockets). htons and</w:t>
-      </w:r>
-    </w:p>
-    <w:p>
-      <w:pPr>
-        <w:pStyle w:val="SourceCode"/>
-      </w:pPr>
-      <w:r>
-        <w:t xml:space="preserve">    // inet_pton write the port and the address the way the network wants.</w:t>
+        <w:t xml:space="preserve">    // can reach the server. sockaddr_in is the sockets record of an IPv4</w:t>
+      </w:r>
+    </w:p>
+    <w:p>
+      <w:pPr>
+        <w:pStyle w:val="SourceCode"/>
+      </w:pPr>
+      <w:r>
+        <w:t xml:space="preserve">    // address and port (Volume 3 teaches sockets); htons and inet_pton write</w:t>
+      </w:r>
+    </w:p>
+    <w:p>
+      <w:pPr>
+        <w:pStyle w:val="SourceCode"/>
+      </w:pPr>
+      <w:r>
+        <w:t xml:space="preserve">    // them for the network; casts below pass it as struct sockaddr (Lesson 2.16).</w:t>
       </w:r>
     </w:p>
     <w:p>
@@ -3770,21 +3771,24 @@
       <w:pPr>
         <w:pStyle w:val="SourceCode"/>
       </w:pPr>
-    </w:p>
-    <w:p>
-      <w:pPr>
-        <w:pStyle w:val="SourceCode"/>
-      </w:pPr>
-      <w:r>
-        <w:t xml:space="preserve">    // Start the server. MHD_USE_TLS turns on HTTPS, and the two thread flags</w:t>
-      </w:r>
-    </w:p>
-    <w:p>
-      <w:pPr>
-        <w:pStyle w:val="SourceCode"/>
-      </w:pPr>
-      <w:r>
-        <w:t xml:space="preserve">    // answer each connection on its own thread, inside the library.</w:t>
+      <w:r>
+        <w:t xml:space="preserve">    // Start the server: | joins the flags (Lesson 3.16), HTTPS and a thread</w:t>
+      </w:r>
+    </w:p>
+    <w:p>
+      <w:pPr>
+        <w:pStyle w:val="SourceCode"/>
+      </w:pPr>
+      <w:r>
+        <w:t xml:space="preserve">    // per connection. Then the port, no connection filter (NULL, NULL),</w:t>
+      </w:r>
+    </w:p>
+    <w:p>
+      <w:pPr>
+        <w:pStyle w:val="SourceCode"/>
+      </w:pPr>
+      <w:r>
+        <w:t xml:space="preserve">    // answer_request, its context (NULL), and options up to MHD_OPTION_END.</w:t>
       </w:r>
     </w:p>
     <w:p>
@@ -4064,23 +4068,23 @@
         <w:pStyle w:val="SourceCode"/>
       </w:pPr>
       <w:r>
-        <w:t>// piece. destination is the char array main passed in; the piece is added</w:t>
-      </w:r>
-    </w:p>
-    <w:p>
-      <w:pPr>
-        <w:pStyle w:val="SourceCode"/>
-      </w:pPr>
-      <w:r>
-        <w:t>// to the end of it. Returns how many bytes it took: anything else tells</w:t>
-      </w:r>
-    </w:p>
-    <w:p>
-      <w:pPr>
-        <w:pStyle w:val="SourceCode"/>
-      </w:pPr>
-      <w:r>
-        <w:t>// libcurl to stop.</w:t>
+        <w:t>// piece, size * count bytes long (size is always 1). destination is the</w:t>
+      </w:r>
+    </w:p>
+    <w:p>
+      <w:pPr>
+        <w:pStyle w:val="SourceCode"/>
+      </w:pPr>
+      <w:r>
+        <w:t>// char array main passed in; the piece is added to the end of it. Returns</w:t>
+      </w:r>
+    </w:p>
+    <w:p>
+      <w:pPr>
+        <w:pStyle w:val="SourceCode"/>
+      </w:pPr>
+      <w:r>
+        <w:t>// how many bytes it took: anything else tells libcurl to stop.</w:t>
       </w:r>
     </w:p>
     <w:p>
@@ -4330,15 +4334,15 @@
         <w:pStyle w:val="SourceCode"/>
       </w:pPr>
       <w:r>
-        <w:t xml:space="preserve">    // curl_easy_perform connects, checks the certificate, sends the GET</w:t>
-      </w:r>
-    </w:p>
-    <w:p>
-      <w:pPr>
-        <w:pStyle w:val="SourceCode"/>
-      </w:pPr>
-      <w:r>
-        <w:t xml:space="preserve">    // request, and receives the answer.</w:t>
+        <w:t xml:space="preserve">    // curl_easy_perform connects, checks the certificate, sends the GET, and</w:t>
+      </w:r>
+    </w:p>
+    <w:p>
+      <w:pPr>
+        <w:pStyle w:val="SourceCode"/>
+      </w:pPr>
+      <w:r>
+        <w:t xml:space="preserve">    // gets the answer: CURLE_OK, or a code curl_easy_strerror puts in words.</w:t>
       </w:r>
     </w:p>
     <w:p>
@@ -4959,6 +4963,9 @@
       <w:pPr>
         <w:pStyle w:val="SourceCode"/>
       </w:pPr>
+      <w:r>
+        <w:t>// Remember, C joins strings written side by side, as in API_PREFIX "/health".</w:t>
+      </w:r>
     </w:p>
     <w:p>
       <w:pPr>
@@ -5196,15 +5203,15 @@
         <w:pStyle w:val="SourceCode"/>
       </w:pPr>
       <w:r>
-        <w:t>// the library keep its own copy of the text, so json_text may be gone by</w:t>
-      </w:r>
-    </w:p>
-    <w:p>
-      <w:pPr>
-        <w:pStyle w:val="SourceCode"/>
-      </w:pPr>
-      <w:r>
-        <w:t>// the time the answer is sent.</w:t>
+        <w:t>// the library keep its own copy of the text, so json_text may be gone before</w:t>
+      </w:r>
+    </w:p>
+    <w:p>
+      <w:pPr>
+        <w:pStyle w:val="SourceCode"/>
+      </w:pPr>
+      <w:r>
+        <w:t>// it is sent; the queue holds the response, so destroy only lets go of ours.</w:t>
       </w:r>
     </w:p>
     <w:p>
@@ -5443,7 +5450,7 @@
         <w:pStyle w:val="SourceCode"/>
       </w:pPr>
       <w:r>
-        <w:t>// sets aside memory for it (Volume 1, Chapter 10 teaches malloc and free),</w:t>
+        <w:t>// sets aside memory for it (Volume 1, Chapter 9 teaches malloc and free),</w:t>
       </w:r>
     </w:p>
     <w:p>
@@ -5669,7 +5676,7 @@
         <w:pStyle w:val="SourceCode"/>
       </w:pPr>
       <w:r>
-        <w:t>// path alone, and request_state holds save_target's copy.</w:t>
+        <w:t>// path alone; request_state holds save_target's copy, or NULL: then use url.</w:t>
       </w:r>
     </w:p>
     <w:p>
@@ -5834,7 +5841,7 @@
         <w:pStyle w:val="SourceCode"/>
       </w:pPr>
       <w:r>
-        <w:t>// Read a whole small text file into contents. Returns 1 on success.</w:t>
+        <w:t>// Read a small text file whole; 1 on success. Remember, feof: end reached.</w:t>
       </w:r>
     </w:p>
     <w:p>
@@ -6158,15 +6165,15 @@
         <w:pStyle w:val="SourceCode"/>
       </w:pPr>
       <w:r>
-        <w:t xml:space="preserve">    // Remember, MHD_USE_TLS turns on HTTPS, and each connection gets its own</w:t>
-      </w:r>
-    </w:p>
-    <w:p>
-      <w:pPr>
-        <w:pStyle w:val="SourceCode"/>
-      </w:pPr>
-      <w:r>
-        <w:t xml:space="preserve">    // thread inside the library.</w:t>
+        <w:t xml:space="preserve">    // Remember, MHD_USE_TLS turns on HTTPS, and each connection gets a thread.</w:t>
+      </w:r>
+    </w:p>
+    <w:p>
+      <w:pPr>
+        <w:pStyle w:val="SourceCode"/>
+      </w:pPr>
+      <w:r>
+        <w:t xml:space="preserve">    // The last two options hand the library save_target and free_target.</w:t>
       </w:r>
     </w:p>
     <w:p>
@@ -6435,6 +6442,9 @@
       <w:pPr>
         <w:pStyle w:val="SourceCode"/>
       </w:pPr>
+      <w:r>
+        <w:t>// Remember, C joins strings written side by side, as in API_BASE "/health".</w:t>
+      </w:r>
     </w:p>
     <w:p>
       <w:pPr>
@@ -6720,7 +6730,7 @@
         <w:pStyle w:val="SourceCode"/>
       </w:pPr>
       <w:r>
-        <w:t xml:space="preserve">    // Give up after 10 seconds instead of waiting forever.</w:t>
+        <w:t xml:space="preserve">    // Give up after 10 seconds, not forever; libcurl reads the number as a long.</w:t>
       </w:r>
     </w:p>
     <w:p>
@@ -7484,7 +7494,7 @@
         <w:pStyle w:val="ListBullet"/>
       </w:pPr>
       <w:r>
-        <w:t>libmicrohttpd hands answer_request the path alone, without the query. To print the target as the client sent it, the server gives the library save_target, which it calls with the whole target before it splits off the query; save_target keeps a copy made with malloc, and free_target gives the memory back with free when the request is finished. Volume 1, Chapter 10 teaches malloc and free.</w:t>
+        <w:t>libmicrohttpd hands answer_request the path alone, without the query. To print the target as the client sent it, the server gives the library save_target, which it calls with the whole target before it splits off the query; save_target keeps a copy made with malloc, and free_target gives the memory back with free when the request is finished. Volume 1, Chapter 9 teaches malloc and free.</w:t>
       </w:r>
     </w:p>
     <w:p>
@@ -8672,6 +8682,9 @@
       <w:pPr>
         <w:pStyle w:val="SourceCode"/>
       </w:pPr>
+      <w:r>
+        <w:t>// Remember, this define turns on cpp-httplib's HTTPS parts.</w:t>
+      </w:r>
     </w:p>
     <w:p>
       <w:pPr>
@@ -9502,6 +9515,9 @@
       <w:pPr>
         <w:pStyle w:val="SourceCode"/>
       </w:pPr>
+      <w:r>
+        <w:t>// Remember, this define turns on cpp-httplib's HTTPS parts.</w:t>
+      </w:r>
     </w:p>
     <w:p>
       <w:pPr>
@@ -10731,6 +10747,9 @@
       <w:pPr>
         <w:pStyle w:val="SourceCode"/>
       </w:pPr>
+      <w:r>
+        <w:t xml:space="preserve">        // CreateBuilder makes a builder for the settings; Build makes the app.</w:t>
+      </w:r>
     </w:p>
     <w:p>
       <w:pPr>
@@ -10769,15 +10788,15 @@
         <w:pStyle w:val="SourceCode"/>
       </w:pPr>
       <w:r>
-        <w:t xml:space="preserve">        // Listen on 127.0.0.1, port 8765, only, so no other computer can</w:t>
-      </w:r>
-    </w:p>
-    <w:p>
-      <w:pPr>
-        <w:pStyle w:val="SourceCode"/>
-      </w:pPr>
-      <w:r>
-        <w:t xml:space="preserve">        // reach the server, and use HTTPS with the certificate.</w:t>
+        <w:t xml:space="preserve">        // ConfigureKestrel calls the lambda (Lesson 2.7) with Kestrel's options:</w:t>
+      </w:r>
+    </w:p>
+    <w:p>
+      <w:pPr>
+        <w:pStyle w:val="SourceCode"/>
+      </w:pPr>
+      <w:r>
+        <w:t xml:space="preserve">        // listen on 127.0.0.1:8765 only, and the inner lambda adds HTTPS to it.</w:t>
       </w:r>
     </w:p>
     <w:p>
@@ -11158,15 +11177,15 @@
         <w:pStyle w:val="SourceCode"/>
       </w:pPr>
       <w:r>
-        <w:t xml:space="preserve">        // The handler makes the connections; SslOptions sets how its TLS</w:t>
-      </w:r>
-    </w:p>
-    <w:p>
-      <w:pPr>
-        <w:pStyle w:val="SourceCode"/>
-      </w:pPr>
-      <w:r>
-        <w:t xml:space="preserve">        // checks the server's certificate. HttpClient sends the requests.</w:t>
+        <w:t xml:space="preserve">        // The handler connects; SslOptions sets how its TLS checks certificates.</w:t>
+      </w:r>
+    </w:p>
+    <w:p>
+      <w:pPr>
+        <w:pStyle w:val="SourceCode"/>
+      </w:pPr>
+      <w:r>
+        <w:t xml:space="preserve">        // HttpClient sends requests. Remember, using closes it when Main ends.</w:t>
       </w:r>
     </w:p>
     <w:p>
@@ -14033,7 +14052,7 @@
       </w:pPr>
       <w:r>
         <w:tab/>
-        <w:t>// Listen on 127.0.0.1, port 8765, only, so no other computer can reach</w:t>
+        <w:t>// Listen on 127.0.0.1, port 8765, only. "tcp" is the kind of connection</w:t>
       </w:r>
     </w:p>
     <w:p>
@@ -14044,7 +14063,7 @@
         <w:tab/>
       </w:r>
       <w:r>
-        <w:t>// the server. The port is open once net.Listen returns.</w:t>
+        <w:t>// HTTP uses (Lesson 7.6). The port is open once net.Listen returns.</w:t>
       </w:r>
     </w:p>
     <w:p>
@@ -17048,15 +17067,15 @@
         <w:pStyle w:val="SourceCode"/>
       </w:pPr>
       <w:r>
-        <w:t xml:space="preserve">        # A response is a status, headers, a blank line, then the body.</w:t>
-      </w:r>
-    </w:p>
-    <w:p>
-      <w:pPr>
-        <w:pStyle w:val="SourceCode"/>
-      </w:pPr>
-      <w:r>
-        <w:t xml:space="preserve">        # The body is bytes, so encode turns the text into UTF-8 bytes.</w:t>
+        <w:t xml:space="preserve">        # A response is a status, headers, a blank line (end_headers), then the</w:t>
+      </w:r>
+    </w:p>
+    <w:p>
+      <w:pPr>
+        <w:pStyle w:val="SourceCode"/>
+      </w:pPr>
+      <w:r>
+        <w:t xml:space="preserve">        # body: encode makes UTF-8 bytes; wfile.write writes them to the client.</w:t>
       </w:r>
     </w:p>
     <w:p>
@@ -18100,7 +18119,7 @@
         <w:pStyle w:val="SourceCode"/>
       </w:pPr>
       <w:r>
-        <w:t xml:space="preserve">        # A HEAD request asks for the headers alone, so it gets no body.</w:t>
+        <w:t xml:space="preserve">        # self.command is the method. HEAD asks for the headers alone: no body.</w:t>
       </w:r>
     </w:p>
     <w:p>
@@ -20811,6 +20830,9 @@
       <w:pPr>
         <w:pStyle w:val="SourceCode"/>
       </w:pPr>
+      <w:r>
+        <w:t>// Remember, import type, above, brings in names used only as types.</w:t>
+      </w:r>
     </w:p>
     <w:p>
       <w:pPr>
@@ -21209,6 +21231,9 @@
       <w:pPr>
         <w:pStyle w:val="SourceCode"/>
       </w:pPr>
+      <w:r>
+        <w:t>// Buffer is Node's type for bytes, which readFileSync returns.</w:t>
+      </w:r>
     </w:p>
     <w:p>
       <w:pPr>
@@ -23746,31 +23771,31 @@
       </w:rPr>
     </w:lvl>
   </w:abstractNum>
-  <w:num w:numId="1" w16cid:durableId="1898122487">
+  <w:num w:numId="1" w16cid:durableId="1874732080">
     <w:abstractNumId w:val="8"/>
   </w:num>
-  <w:num w:numId="2" w16cid:durableId="1912160166">
+  <w:num w:numId="2" w16cid:durableId="548687298">
     <w:abstractNumId w:val="6"/>
   </w:num>
-  <w:num w:numId="3" w16cid:durableId="799301828">
+  <w:num w:numId="3" w16cid:durableId="365907793">
     <w:abstractNumId w:val="5"/>
   </w:num>
-  <w:num w:numId="4" w16cid:durableId="826046436">
+  <w:num w:numId="4" w16cid:durableId="1923683231">
     <w:abstractNumId w:val="4"/>
   </w:num>
-  <w:num w:numId="5" w16cid:durableId="159004587">
+  <w:num w:numId="5" w16cid:durableId="1840999643">
     <w:abstractNumId w:val="7"/>
   </w:num>
-  <w:num w:numId="6" w16cid:durableId="1371955624">
+  <w:num w:numId="6" w16cid:durableId="1041436715">
     <w:abstractNumId w:val="3"/>
   </w:num>
-  <w:num w:numId="7" w16cid:durableId="1377118000">
+  <w:num w:numId="7" w16cid:durableId="1525091141">
     <w:abstractNumId w:val="2"/>
   </w:num>
-  <w:num w:numId="8" w16cid:durableId="1263948908">
+  <w:num w:numId="8" w16cid:durableId="194657334">
     <w:abstractNumId w:val="1"/>
   </w:num>
-  <w:num w:numId="9" w16cid:durableId="198973537">
+  <w:num w:numId="9" w16cid:durableId="12343443">
     <w:abstractNumId w:val="0"/>
   </w:num>
 </w:numbering>

</xml_diff>